<commit_message>
docs: add project documentation, test plans, and deployment guides
</commit_message>
<xml_diff>
--- a/docs/phieu-pham-vi.docx
+++ b/docs/phieu-pham-vi.docx
@@ -368,7 +368,7 @@
                 <w:rFonts w:ascii="Segoe UI" w:hAnsi="Segoe UI"/>
                 <w:sz w:val="19"/>
               </w:rPr>
-              <w:t>2174802010... (Trưởng nhóm)</w:t>
+              <w:t>2174802010839 (Trưởng nhóm)</w:t>
             </w:r>
           </w:p>
         </w:tc>
@@ -393,7 +393,7 @@
                 <w:rFonts w:ascii="Segoe UI" w:hAnsi="Segoe UI"/>
                 <w:sz w:val="19"/>
               </w:rPr>
-              <w:t>Project Manager (PM) &amp; Backend Lead</w:t>
+              <w:t>Tech Lead &amp; Frontend Lead</w:t>
             </w:r>
           </w:p>
         </w:tc>
@@ -418,7 +418,7 @@
                 <w:rFonts w:ascii="Segoe UI" w:hAnsi="Segoe UI"/>
                 <w:sz w:val="19"/>
               </w:rPr>
-              <w:t>Quản lý tiến độ Scrum, thiết kế kiến trúc Spring Boot, xác thực JWT &amp; phân quyền RBAC, thiết kế CSDL PostgreSQL.</w:t>
+              <w:t>Quản lý kỹ thuật và tiến độ Sprint, xây dựng toàn bộ giao diện Web React 18 TypeScript Vite, thiết kế UI/UX, hỗ trợ Dark Mode và song ngữ VI/EN.</w:t>
             </w:r>
           </w:p>
         </w:tc>
@@ -494,7 +494,7 @@
                 <w:rFonts w:ascii="Segoe UI" w:hAnsi="Segoe UI"/>
                 <w:sz w:val="19"/>
               </w:rPr>
-              <w:t>2174802010... (Thành viên)</w:t>
+              <w:t>2174802010842 (Thành viên)</w:t>
             </w:r>
           </w:p>
         </w:tc>
@@ -519,7 +519,7 @@
                 <w:rFonts w:ascii="Segoe UI" w:hAnsi="Segoe UI"/>
                 <w:sz w:val="19"/>
               </w:rPr>
-              <w:t>Business Analyst (BA) &amp; Frontend Lead</w:t>
+              <w:t>Business Analyst (BA) &amp; DevOps Lead</w:t>
             </w:r>
           </w:p>
         </w:tc>
@@ -544,7 +544,22 @@
                 <w:rFonts w:ascii="Segoe UI" w:hAnsi="Segoe UI"/>
                 <w:sz w:val="19"/>
               </w:rPr>
-              <w:t>Thu thập &amp; đặc tả yêu cầu (SRS), thiết kế API Contract, xây dựng giao diện ReactJS + TypeScript, tích hợp REST API.</w:t>
+              <w:t>Thu thập &amp; đặc tả yêu cầu (SRS, 14 User Stories), thiết kế API Contract, đóng gói cụm container Docker Compose, cấu hình tự động hóa script 1-Click launcher (</w:t>
+            </w:r>
+            <w:r>
+              <w:rPr>
+                <w:rFonts w:ascii="Consolas" w:hAnsi="Consolas"/>
+                <w:color w:val="B42828"/>
+                <w:sz w:val="19"/>
+              </w:rPr>
+              <w:t>run.bat</w:t>
+            </w:r>
+            <w:r>
+              <w:rPr>
+                <w:rFonts w:ascii="Segoe UI" w:hAnsi="Segoe UI"/>
+                <w:sz w:val="19"/>
+              </w:rPr>
+              <w:t>).</w:t>
             </w:r>
           </w:p>
         </w:tc>
@@ -595,7 +610,7 @@
               <w:rPr>
                 <w:b/>
               </w:rPr>
-              <w:t>Hoàng Long (Bảo Long)</w:t>
+              <w:t>Hoàng Bảo Long</w:t>
             </w:r>
           </w:p>
         </w:tc>
@@ -620,7 +635,7 @@
                 <w:rFonts w:ascii="Segoe UI" w:hAnsi="Segoe UI"/>
                 <w:sz w:val="19"/>
               </w:rPr>
-              <w:t>2174802010... (Thành viên)</w:t>
+              <w:t>2174802010850 (Thành viên)</w:t>
             </w:r>
           </w:p>
         </w:tc>
@@ -645,7 +660,7 @@
                 <w:rFonts w:ascii="Segoe UI" w:hAnsi="Segoe UI"/>
                 <w:sz w:val="19"/>
               </w:rPr>
-              <w:t>QA / Tester &amp; DevOps Lead</w:t>
+              <w:t>QA/QC &amp; Backend Lead</w:t>
             </w:r>
           </w:p>
         </w:tc>
@@ -670,7 +685,7 @@
                 <w:rFonts w:ascii="Segoe UI" w:hAnsi="Segoe UI"/>
                 <w:sz w:val="19"/>
               </w:rPr>
-              <w:t>Lập kế hoạch kiểm thử (Test Plan), viết kịch bản kiểm thử Postman &amp; JUnit 5, đóng gói Docker Compose và tự động hóa khởi chạy.</w:t>
+              <w:t>Thiết kế CSDL 7 bảng chuẩn 3NF, lập trình toàn bộ Backend RESTful API Spring Boot 3 &amp; JWT Stateless, lập và thực thi Kế hoạch kiểm thử Test Plan 21/21 Pass.</w:t>
             </w:r>
           </w:p>
         </w:tc>
@@ -1906,6 +1921,76 @@
         <w:t>4. KẾ HOẠCH TRIỂN KHAI THEO SPRINT (10 BUỔI AGILE)</w:t>
       </w:r>
     </w:p>
+    <w:p>
+      <w:pPr>
+        <w:spacing w:before="80" w:after="80"/>
+        <w:ind w:left="432"/>
+        <w:pBdr>
+          <w:left w:val="single" w:sz="24" w:space="8" w:color="F59E0B"/>
+        </w:pBdr>
+        <w:shd w:fill="FEF3C7"/>
+      </w:pPr>
+      <w:r>
+        <w:rPr>
+          <w:b/>
+          <w:i/>
+          <w:color w:val="92400E"/>
+          <w:sz w:val="20"/>
+        </w:rPr>
+        <w:t>📅 Lịch:</w:t>
+      </w:r>
+      <w:r>
+        <w:rPr>
+          <w:i/>
+          <w:color w:val="92400E"/>
+          <w:sz w:val="20"/>
+        </w:rPr>
+        <w:t xml:space="preserve"> Mỗi buổi = 1 tuần | Buổi 1: </w:t>
+      </w:r>
+      <w:r>
+        <w:rPr>
+          <w:b/>
+          <w:i/>
+          <w:color w:val="92400E"/>
+          <w:sz w:val="20"/>
+        </w:rPr>
+        <w:t>25/09/2026</w:t>
+      </w:r>
+      <w:r>
+        <w:rPr>
+          <w:i/>
+          <w:color w:val="92400E"/>
+          <w:sz w:val="20"/>
+        </w:rPr>
+        <w:t xml:space="preserve"> | Buổi 5: </w:t>
+      </w:r>
+      <w:r>
+        <w:rPr>
+          <w:b/>
+          <w:i/>
+          <w:color w:val="92400E"/>
+          <w:sz w:val="20"/>
+        </w:rPr>
+        <w:t>23/10/2026</w:t>
+      </w:r>
+      <w:r>
+        <w:rPr>
+          <w:i/>
+          <w:color w:val="92400E"/>
+          <w:sz w:val="20"/>
+        </w:rPr>
+        <w:t xml:space="preserve"> | Buổi 10: </w:t>
+      </w:r>
+      <w:r>
+        <w:rPr>
+          <w:b/>
+          <w:i/>
+          <w:color w:val="92400E"/>
+          <w:sz w:val="20"/>
+        </w:rPr>
+        <w:t>27/11/2026</w:t>
+      </w:r>
+    </w:p>
     <w:tbl>
       <w:tblPr>
         <w:tblStyle w:val="TableGrid"/>
@@ -1915,15 +2000,16 @@
         <w:tblLook w:firstColumn="1" w:firstRow="1" w:lastColumn="0" w:lastRow="0" w:noHBand="0" w:noVBand="1" w:val="04A0"/>
       </w:tblPr>
       <w:tblGrid>
-        <w:gridCol w:w="2340"/>
-        <w:gridCol w:w="2340"/>
-        <w:gridCol w:w="2340"/>
-        <w:gridCol w:w="2340"/>
+        <w:gridCol w:w="1872"/>
+        <w:gridCol w:w="1872"/>
+        <w:gridCol w:w="1872"/>
+        <w:gridCol w:w="1872"/>
+        <w:gridCol w:w="1872"/>
       </w:tblGrid>
       <w:tr>
         <w:tc>
           <w:tcPr>
-            <w:tcW w:type="dxa" w:w="2340"/>
+            <w:tcW w:type="dxa" w:w="1872"/>
             <w:shd w:fill="4F46E5"/>
             <w:tcMar>
               <w:top w:w="140" w:type="dxa"/>
@@ -1951,7 +2037,7 @@
         </w:tc>
         <w:tc>
           <w:tcPr>
-            <w:tcW w:type="dxa" w:w="2340"/>
+            <w:tcW w:type="dxa" w:w="1872"/>
             <w:shd w:fill="4F46E5"/>
             <w:tcMar>
               <w:top w:w="140" w:type="dxa"/>
@@ -1979,7 +2065,35 @@
         </w:tc>
         <w:tc>
           <w:tcPr>
-            <w:tcW w:type="dxa" w:w="2340"/>
+            <w:tcW w:type="dxa" w:w="1872"/>
+            <w:shd w:fill="4F46E5"/>
+            <w:tcMar>
+              <w:top w:w="140" w:type="dxa"/>
+              <w:bottom w:w="140" w:type="dxa"/>
+              <w:left w:w="180" w:type="dxa"/>
+              <w:right w:w="180" w:type="dxa"/>
+            </w:tcMar>
+            <w:vAlign w:val="center"/>
+          </w:tcPr>
+          <w:p>
+            <w:pPr>
+              <w:spacing w:before="40" w:after="40"/>
+              <w:jc w:val="left"/>
+            </w:pPr>
+            <w:r>
+              <w:rPr>
+                <w:rFonts w:ascii="Segoe UI" w:hAnsi="Segoe UI"/>
+                <w:b/>
+                <w:color w:val="FFFFFF"/>
+                <w:sz w:val="20"/>
+              </w:rPr>
+              <w:t>Ngày</w:t>
+            </w:r>
+          </w:p>
+        </w:tc>
+        <w:tc>
+          <w:tcPr>
+            <w:tcW w:type="dxa" w:w="1872"/>
             <w:shd w:fill="4F46E5"/>
             <w:tcMar>
               <w:top w:w="140" w:type="dxa"/>
@@ -2007,7 +2121,7 @@
         </w:tc>
         <w:tc>
           <w:tcPr>
-            <w:tcW w:type="dxa" w:w="2340"/>
+            <w:tcW w:type="dxa" w:w="1872"/>
             <w:shd w:fill="4F46E5"/>
             <w:tcMar>
               <w:top w:w="140" w:type="dxa"/>
@@ -2037,7 +2151,7 @@
       <w:tr>
         <w:tc>
           <w:tcPr>
-            <w:tcW w:type="dxa" w:w="2340"/>
+            <w:tcW w:type="dxa" w:w="1872"/>
             <w:shd w:fill="FFFFFF"/>
             <w:tcMar>
               <w:top w:w="120" w:type="dxa"/>
@@ -2061,7 +2175,7 @@
         </w:tc>
         <w:tc>
           <w:tcPr>
-            <w:tcW w:type="dxa" w:w="2340"/>
+            <w:tcW w:type="dxa" w:w="1872"/>
             <w:shd w:fill="FFFFFF"/>
             <w:tcMar>
               <w:top w:w="120" w:type="dxa"/>
@@ -2080,13 +2194,13 @@
                 <w:rFonts w:ascii="Segoe UI" w:hAnsi="Segoe UI"/>
                 <w:sz w:val="19"/>
               </w:rPr>
-              <w:t>Buổi 1–3</w:t>
+              <w:t>Buổi 1</w:t>
             </w:r>
           </w:p>
         </w:tc>
         <w:tc>
           <w:tcPr>
-            <w:tcW w:type="dxa" w:w="2340"/>
+            <w:tcW w:type="dxa" w:w="1872"/>
             <w:shd w:fill="FFFFFF"/>
             <w:tcMar>
               <w:top w:w="120" w:type="dxa"/>
@@ -2105,13 +2219,13 @@
                 <w:rFonts w:ascii="Segoe UI" w:hAnsi="Segoe UI"/>
                 <w:sz w:val="19"/>
               </w:rPr>
-              <w:t>Khảo sát nhu cầu sinh viên, xác định Actor, viết SRS, lập Product Backlog.</w:t>
+              <w:t>25/09/2026</w:t>
             </w:r>
           </w:p>
         </w:tc>
         <w:tc>
           <w:tcPr>
-            <w:tcW w:type="dxa" w:w="2340"/>
+            <w:tcW w:type="dxa" w:w="1872"/>
             <w:shd w:fill="FFFFFF"/>
             <w:tcMar>
               <w:top w:w="120" w:type="dxa"/>
@@ -2130,7 +2244,32 @@
                 <w:rFonts w:ascii="Segoe UI" w:hAnsi="Segoe UI"/>
                 <w:sz w:val="19"/>
               </w:rPr>
-              <w:t>Phiếu phạm vi, SRS v1.0, Product Backlog.</w:t>
+              <w:t>Thành lập nhóm, đăng ký đề tài, phân vai trò kỹ thuật.</w:t>
+            </w:r>
+          </w:p>
+        </w:tc>
+        <w:tc>
+          <w:tcPr>
+            <w:tcW w:type="dxa" w:w="1872"/>
+            <w:shd w:fill="FFFFFF"/>
+            <w:tcMar>
+              <w:top w:w="120" w:type="dxa"/>
+              <w:bottom w:w="120" w:type="dxa"/>
+              <w:left w:w="160" w:type="dxa"/>
+              <w:right w:w="160" w:type="dxa"/>
+            </w:tcMar>
+            <w:vAlign w:val="center"/>
+          </w:tcPr>
+          <w:p>
+            <w:pPr>
+              <w:spacing w:before="20" w:after="20" w:line="276" w:lineRule="auto"/>
+            </w:pPr>
+            <w:r>
+              <w:rPr>
+                <w:rFonts w:ascii="Segoe UI" w:hAnsi="Segoe UI"/>
+                <w:sz w:val="19"/>
+              </w:rPr>
+              <w:t>Phiếu xác nhận đề tài, danh sách thành viên + vai trò RACI.</w:t>
             </w:r>
           </w:p>
         </w:tc>
@@ -2138,7 +2277,259 @@
       <w:tr>
         <w:tc>
           <w:tcPr>
-            <w:tcW w:type="dxa" w:w="2340"/>
+            <w:tcW w:type="dxa" w:w="1872"/>
+            <w:shd w:fill="F8FAFC"/>
+            <w:tcMar>
+              <w:top w:w="120" w:type="dxa"/>
+              <w:bottom w:w="120" w:type="dxa"/>
+              <w:left w:w="160" w:type="dxa"/>
+              <w:right w:w="160" w:type="dxa"/>
+            </w:tcMar>
+            <w:vAlign w:val="center"/>
+          </w:tcPr>
+          <w:p>
+            <w:pPr>
+              <w:spacing w:before="20" w:after="20" w:line="276" w:lineRule="auto"/>
+            </w:pPr>
+            <w:r>
+              <w:rPr>
+                <w:b/>
+              </w:rPr>
+              <w:t>Sprint 0</w:t>
+            </w:r>
+          </w:p>
+        </w:tc>
+        <w:tc>
+          <w:tcPr>
+            <w:tcW w:type="dxa" w:w="1872"/>
+            <w:shd w:fill="F8FAFC"/>
+            <w:tcMar>
+              <w:top w:w="120" w:type="dxa"/>
+              <w:bottom w:w="120" w:type="dxa"/>
+              <w:left w:w="160" w:type="dxa"/>
+              <w:right w:w="160" w:type="dxa"/>
+            </w:tcMar>
+            <w:vAlign w:val="center"/>
+          </w:tcPr>
+          <w:p>
+            <w:pPr>
+              <w:spacing w:before="20" w:after="20" w:line="276" w:lineRule="auto"/>
+            </w:pPr>
+            <w:r>
+              <w:rPr>
+                <w:rFonts w:ascii="Segoe UI" w:hAnsi="Segoe UI"/>
+                <w:sz w:val="19"/>
+              </w:rPr>
+              <w:t>Buổi 2</w:t>
+            </w:r>
+          </w:p>
+        </w:tc>
+        <w:tc>
+          <w:tcPr>
+            <w:tcW w:type="dxa" w:w="1872"/>
+            <w:shd w:fill="F8FAFC"/>
+            <w:tcMar>
+              <w:top w:w="120" w:type="dxa"/>
+              <w:bottom w:w="120" w:type="dxa"/>
+              <w:left w:w="160" w:type="dxa"/>
+              <w:right w:w="160" w:type="dxa"/>
+            </w:tcMar>
+            <w:vAlign w:val="center"/>
+          </w:tcPr>
+          <w:p>
+            <w:pPr>
+              <w:spacing w:before="20" w:after="20" w:line="276" w:lineRule="auto"/>
+            </w:pPr>
+            <w:r>
+              <w:rPr>
+                <w:rFonts w:ascii="Segoe UI" w:hAnsi="Segoe UI"/>
+                <w:sz w:val="19"/>
+              </w:rPr>
+              <w:t>02/10/2026</w:t>
+            </w:r>
+          </w:p>
+        </w:tc>
+        <w:tc>
+          <w:tcPr>
+            <w:tcW w:type="dxa" w:w="1872"/>
+            <w:shd w:fill="F8FAFC"/>
+            <w:tcMar>
+              <w:top w:w="120" w:type="dxa"/>
+              <w:bottom w:w="120" w:type="dxa"/>
+              <w:left w:w="160" w:type="dxa"/>
+              <w:right w:w="160" w:type="dxa"/>
+            </w:tcMar>
+            <w:vAlign w:val="center"/>
+          </w:tcPr>
+          <w:p>
+            <w:pPr>
+              <w:spacing w:before="20" w:after="20" w:line="276" w:lineRule="auto"/>
+            </w:pPr>
+            <w:r>
+              <w:rPr>
+                <w:rFonts w:ascii="Segoe UI" w:hAnsi="Segoe UI"/>
+                <w:sz w:val="19"/>
+              </w:rPr>
+              <w:t>Phân tích bài toán 5W1H, viết SRS v1.0, lập ma trận FR-NFR.</w:t>
+            </w:r>
+          </w:p>
+        </w:tc>
+        <w:tc>
+          <w:tcPr>
+            <w:tcW w:type="dxa" w:w="1872"/>
+            <w:shd w:fill="F8FAFC"/>
+            <w:tcMar>
+              <w:top w:w="120" w:type="dxa"/>
+              <w:bottom w:w="120" w:type="dxa"/>
+              <w:left w:w="160" w:type="dxa"/>
+              <w:right w:w="160" w:type="dxa"/>
+            </w:tcMar>
+            <w:vAlign w:val="center"/>
+          </w:tcPr>
+          <w:p>
+            <w:pPr>
+              <w:spacing w:before="20" w:after="20" w:line="276" w:lineRule="auto"/>
+            </w:pPr>
+            <w:r>
+              <w:rPr>
+                <w:rFonts w:ascii="Segoe UI" w:hAnsi="Segoe UI"/>
+                <w:sz w:val="19"/>
+              </w:rPr>
+              <w:t>SRS v1.0, 11 FR + 4 NFR.</w:t>
+            </w:r>
+          </w:p>
+        </w:tc>
+      </w:tr>
+      <w:tr>
+        <w:tc>
+          <w:tcPr>
+            <w:tcW w:type="dxa" w:w="1872"/>
+            <w:shd w:fill="FFFFFF"/>
+            <w:tcMar>
+              <w:top w:w="120" w:type="dxa"/>
+              <w:bottom w:w="120" w:type="dxa"/>
+              <w:left w:w="160" w:type="dxa"/>
+              <w:right w:w="160" w:type="dxa"/>
+            </w:tcMar>
+            <w:vAlign w:val="center"/>
+          </w:tcPr>
+          <w:p>
+            <w:pPr>
+              <w:spacing w:before="20" w:after="20" w:line="276" w:lineRule="auto"/>
+            </w:pPr>
+            <w:r>
+              <w:rPr>
+                <w:b/>
+              </w:rPr>
+              <w:t>Sprint 0</w:t>
+            </w:r>
+          </w:p>
+        </w:tc>
+        <w:tc>
+          <w:tcPr>
+            <w:tcW w:type="dxa" w:w="1872"/>
+            <w:shd w:fill="FFFFFF"/>
+            <w:tcMar>
+              <w:top w:w="120" w:type="dxa"/>
+              <w:bottom w:w="120" w:type="dxa"/>
+              <w:left w:w="160" w:type="dxa"/>
+              <w:right w:w="160" w:type="dxa"/>
+            </w:tcMar>
+            <w:vAlign w:val="center"/>
+          </w:tcPr>
+          <w:p>
+            <w:pPr>
+              <w:spacing w:before="20" w:after="20" w:line="276" w:lineRule="auto"/>
+            </w:pPr>
+            <w:r>
+              <w:rPr>
+                <w:rFonts w:ascii="Segoe UI" w:hAnsi="Segoe UI"/>
+                <w:sz w:val="19"/>
+              </w:rPr>
+              <w:t>Buổi 3</w:t>
+            </w:r>
+          </w:p>
+        </w:tc>
+        <w:tc>
+          <w:tcPr>
+            <w:tcW w:type="dxa" w:w="1872"/>
+            <w:shd w:fill="FFFFFF"/>
+            <w:tcMar>
+              <w:top w:w="120" w:type="dxa"/>
+              <w:bottom w:w="120" w:type="dxa"/>
+              <w:left w:w="160" w:type="dxa"/>
+              <w:right w:w="160" w:type="dxa"/>
+            </w:tcMar>
+            <w:vAlign w:val="center"/>
+          </w:tcPr>
+          <w:p>
+            <w:pPr>
+              <w:spacing w:before="20" w:after="20" w:line="276" w:lineRule="auto"/>
+            </w:pPr>
+            <w:r>
+              <w:rPr>
+                <w:rFonts w:ascii="Segoe UI" w:hAnsi="Segoe UI"/>
+                <w:sz w:val="19"/>
+              </w:rPr>
+              <w:t>09/10/2026</w:t>
+            </w:r>
+          </w:p>
+        </w:tc>
+        <w:tc>
+          <w:tcPr>
+            <w:tcW w:type="dxa" w:w="1872"/>
+            <w:shd w:fill="FFFFFF"/>
+            <w:tcMar>
+              <w:top w:w="120" w:type="dxa"/>
+              <w:bottom w:w="120" w:type="dxa"/>
+              <w:left w:w="160" w:type="dxa"/>
+              <w:right w:w="160" w:type="dxa"/>
+            </w:tcMar>
+            <w:vAlign w:val="center"/>
+          </w:tcPr>
+          <w:p>
+            <w:pPr>
+              <w:spacing w:before="20" w:after="20" w:line="276" w:lineRule="auto"/>
+            </w:pPr>
+            <w:r>
+              <w:rPr>
+                <w:rFonts w:ascii="Segoe UI" w:hAnsi="Segoe UI"/>
+                <w:sz w:val="19"/>
+              </w:rPr>
+              <w:t>Xây dựng Product Backlog MoSCoW, 14 User Stories (48 pts), kế hoạch 5 Sprint.</w:t>
+            </w:r>
+          </w:p>
+        </w:tc>
+        <w:tc>
+          <w:tcPr>
+            <w:tcW w:type="dxa" w:w="1872"/>
+            <w:shd w:fill="FFFFFF"/>
+            <w:tcMar>
+              <w:top w:w="120" w:type="dxa"/>
+              <w:bottom w:w="120" w:type="dxa"/>
+              <w:left w:w="160" w:type="dxa"/>
+              <w:right w:w="160" w:type="dxa"/>
+            </w:tcMar>
+            <w:vAlign w:val="center"/>
+          </w:tcPr>
+          <w:p>
+            <w:pPr>
+              <w:spacing w:before="20" w:after="20" w:line="276" w:lineRule="auto"/>
+            </w:pPr>
+            <w:r>
+              <w:rPr>
+                <w:rFonts w:ascii="Segoe UI" w:hAnsi="Segoe UI"/>
+                <w:sz w:val="19"/>
+              </w:rPr>
+              <w:t>Phiếu phạm vi, Product Backlog.</w:t>
+            </w:r>
+          </w:p>
+        </w:tc>
+      </w:tr>
+      <w:tr>
+        <w:tc>
+          <w:tcPr>
+            <w:tcW w:type="dxa" w:w="1872"/>
             <w:shd w:fill="F8FAFC"/>
             <w:tcMar>
               <w:top w:w="120" w:type="dxa"/>
@@ -2162,7 +2553,7 @@
         </w:tc>
         <w:tc>
           <w:tcPr>
-            <w:tcW w:type="dxa" w:w="2340"/>
+            <w:tcW w:type="dxa" w:w="1872"/>
             <w:shd w:fill="F8FAFC"/>
             <w:tcMar>
               <w:top w:w="120" w:type="dxa"/>
@@ -2181,13 +2572,13 @@
                 <w:rFonts w:ascii="Segoe UI" w:hAnsi="Segoe UI"/>
                 <w:sz w:val="19"/>
               </w:rPr>
-              <w:t>Buổi 4–5</w:t>
+              <w:t>Buổi 4</w:t>
             </w:r>
           </w:p>
         </w:tc>
         <w:tc>
           <w:tcPr>
-            <w:tcW w:type="dxa" w:w="2340"/>
+            <w:tcW w:type="dxa" w:w="1872"/>
             <w:shd w:fill="F8FAFC"/>
             <w:tcMar>
               <w:top w:w="120" w:type="dxa"/>
@@ -2206,13 +2597,13 @@
                 <w:rFonts w:ascii="Segoe UI" w:hAnsi="Segoe UI"/>
                 <w:sz w:val="19"/>
               </w:rPr>
-              <w:t>Thiết kế kiến trúc 3 lớp, thiết kế CSDL (ERD), đặc tả REST API Contract, vẽ Wireframe.</w:t>
+              <w:t>16/10/2026</w:t>
             </w:r>
           </w:p>
         </w:tc>
         <w:tc>
           <w:tcPr>
-            <w:tcW w:type="dxa" w:w="2340"/>
+            <w:tcW w:type="dxa" w:w="1872"/>
             <w:shd w:fill="F8FAFC"/>
             <w:tcMar>
               <w:top w:w="120" w:type="dxa"/>
@@ -2231,7 +2622,32 @@
                 <w:rFonts w:ascii="Segoe UI" w:hAnsi="Segoe UI"/>
                 <w:sz w:val="19"/>
               </w:rPr>
-              <w:t>Tài liệu kiến trúc, file ERD DrawIO, API Contract, Wireframes Prototype.</w:t>
+              <w:t>Thiết kế kiến trúc 3 lớp, ERD 7 bảng, 13 indexes, đặc tả API Contract Swagger.</w:t>
+            </w:r>
+          </w:p>
+        </w:tc>
+        <w:tc>
+          <w:tcPr>
+            <w:tcW w:type="dxa" w:w="1872"/>
+            <w:shd w:fill="F8FAFC"/>
+            <w:tcMar>
+              <w:top w:w="120" w:type="dxa"/>
+              <w:bottom w:w="120" w:type="dxa"/>
+              <w:left w:w="160" w:type="dxa"/>
+              <w:right w:w="160" w:type="dxa"/>
+            </w:tcMar>
+            <w:vAlign w:val="center"/>
+          </w:tcPr>
+          <w:p>
+            <w:pPr>
+              <w:spacing w:before="20" w:after="20" w:line="276" w:lineRule="auto"/>
+            </w:pPr>
+            <w:r>
+              <w:rPr>
+                <w:rFonts w:ascii="Segoe UI" w:hAnsi="Segoe UI"/>
+                <w:sz w:val="19"/>
+              </w:rPr>
+              <w:t>Tài liệu kiến trúc, ERD DrawIO, API Contract OpenAPI 3.0.</w:t>
             </w:r>
           </w:p>
         </w:tc>
@@ -2239,8 +2655,132 @@
       <w:tr>
         <w:tc>
           <w:tcPr>
-            <w:tcW w:type="dxa" w:w="2340"/>
+            <w:tcW w:type="dxa" w:w="1872"/>
             <w:shd w:fill="FFFFFF"/>
+            <w:tcMar>
+              <w:top w:w="120" w:type="dxa"/>
+              <w:bottom w:w="120" w:type="dxa"/>
+              <w:left w:w="160" w:type="dxa"/>
+              <w:right w:w="160" w:type="dxa"/>
+            </w:tcMar>
+            <w:vAlign w:val="center"/>
+          </w:tcPr>
+          <w:p>
+            <w:pPr>
+              <w:spacing w:before="20" w:after="20" w:line="276" w:lineRule="auto"/>
+            </w:pPr>
+            <w:r>
+              <w:rPr>
+                <w:b/>
+              </w:rPr>
+              <w:t>Sprint 1</w:t>
+            </w:r>
+          </w:p>
+        </w:tc>
+        <w:tc>
+          <w:tcPr>
+            <w:tcW w:type="dxa" w:w="1872"/>
+            <w:shd w:fill="FFFFFF"/>
+            <w:tcMar>
+              <w:top w:w="120" w:type="dxa"/>
+              <w:bottom w:w="120" w:type="dxa"/>
+              <w:left w:w="160" w:type="dxa"/>
+              <w:right w:w="160" w:type="dxa"/>
+            </w:tcMar>
+            <w:vAlign w:val="center"/>
+          </w:tcPr>
+          <w:p>
+            <w:pPr>
+              <w:spacing w:before="20" w:after="20" w:line="276" w:lineRule="auto"/>
+            </w:pPr>
+            <w:r>
+              <w:rPr>
+                <w:b/>
+              </w:rPr>
+              <w:t>Buổi 5</w:t>
+            </w:r>
+          </w:p>
+        </w:tc>
+        <w:tc>
+          <w:tcPr>
+            <w:tcW w:type="dxa" w:w="1872"/>
+            <w:shd w:fill="FFFFFF"/>
+            <w:tcMar>
+              <w:top w:w="120" w:type="dxa"/>
+              <w:bottom w:w="120" w:type="dxa"/>
+              <w:left w:w="160" w:type="dxa"/>
+              <w:right w:w="160" w:type="dxa"/>
+            </w:tcMar>
+            <w:vAlign w:val="center"/>
+          </w:tcPr>
+          <w:p>
+            <w:pPr>
+              <w:spacing w:before="20" w:after="20" w:line="276" w:lineRule="auto"/>
+            </w:pPr>
+            <w:r>
+              <w:rPr>
+                <w:b/>
+              </w:rPr>
+              <w:t>23/10/2026 ⭐ Giữa kỳ</w:t>
+            </w:r>
+          </w:p>
+        </w:tc>
+        <w:tc>
+          <w:tcPr>
+            <w:tcW w:type="dxa" w:w="1872"/>
+            <w:shd w:fill="FFFFFF"/>
+            <w:tcMar>
+              <w:top w:w="120" w:type="dxa"/>
+              <w:bottom w:w="120" w:type="dxa"/>
+              <w:left w:w="160" w:type="dxa"/>
+              <w:right w:w="160" w:type="dxa"/>
+            </w:tcMar>
+            <w:vAlign w:val="center"/>
+          </w:tcPr>
+          <w:p>
+            <w:pPr>
+              <w:spacing w:before="20" w:after="20" w:line="276" w:lineRule="auto"/>
+            </w:pPr>
+            <w:r>
+              <w:rPr>
+                <w:rFonts w:ascii="Segoe UI" w:hAnsi="Segoe UI"/>
+                <w:sz w:val="19"/>
+              </w:rPr>
+              <w:t>Thiết kế Wireframe UI, báo cáo nghiệm thu giữa kỳ (Rubric 2).</w:t>
+            </w:r>
+          </w:p>
+        </w:tc>
+        <w:tc>
+          <w:tcPr>
+            <w:tcW w:type="dxa" w:w="1872"/>
+            <w:shd w:fill="FFFFFF"/>
+            <w:tcMar>
+              <w:top w:w="120" w:type="dxa"/>
+              <w:bottom w:w="120" w:type="dxa"/>
+              <w:left w:w="160" w:type="dxa"/>
+              <w:right w:w="160" w:type="dxa"/>
+            </w:tcMar>
+            <w:vAlign w:val="center"/>
+          </w:tcPr>
+          <w:p>
+            <w:pPr>
+              <w:spacing w:before="20" w:after="20" w:line="276" w:lineRule="auto"/>
+            </w:pPr>
+            <w:r>
+              <w:rPr>
+                <w:rFonts w:ascii="Segoe UI" w:hAnsi="Segoe UI"/>
+                <w:sz w:val="19"/>
+              </w:rPr>
+              <w:t>Wireframes, Slide thuyết trình Buổi 5, Gantt Chart cập nhật.</w:t>
+            </w:r>
+          </w:p>
+        </w:tc>
+      </w:tr>
+      <w:tr>
+        <w:tc>
+          <w:tcPr>
+            <w:tcW w:type="dxa" w:w="1872"/>
+            <w:shd w:fill="F8FAFC"/>
             <w:tcMar>
               <w:top w:w="120" w:type="dxa"/>
               <w:bottom w:w="120" w:type="dxa"/>
@@ -2263,8 +2803,8 @@
         </w:tc>
         <w:tc>
           <w:tcPr>
-            <w:tcW w:type="dxa" w:w="2340"/>
-            <w:shd w:fill="FFFFFF"/>
+            <w:tcW w:type="dxa" w:w="1872"/>
+            <w:shd w:fill="F8FAFC"/>
             <w:tcMar>
               <w:top w:w="120" w:type="dxa"/>
               <w:bottom w:w="120" w:type="dxa"/>
@@ -2288,8 +2828,8 @@
         </w:tc>
         <w:tc>
           <w:tcPr>
-            <w:tcW w:type="dxa" w:w="2340"/>
-            <w:shd w:fill="FFFFFF"/>
+            <w:tcW w:type="dxa" w:w="1872"/>
+            <w:shd w:fill="F8FAFC"/>
             <w:tcMar>
               <w:top w:w="120" w:type="dxa"/>
               <w:bottom w:w="120" w:type="dxa"/>
@@ -2307,14 +2847,39 @@
                 <w:rFonts w:ascii="Segoe UI" w:hAnsi="Segoe UI"/>
                 <w:sz w:val="19"/>
               </w:rPr>
-              <w:t>Lập trình Backend xác thực JWT, mã hóa BCrypt, module hồ sơ; dựng khung Frontend React.</w:t>
+              <w:t>30/10/2026</w:t>
             </w:r>
           </w:p>
         </w:tc>
         <w:tc>
           <w:tcPr>
-            <w:tcW w:type="dxa" w:w="2340"/>
-            <w:shd w:fill="FFFFFF"/>
+            <w:tcW w:type="dxa" w:w="1872"/>
+            <w:shd w:fill="F8FAFC"/>
+            <w:tcMar>
+              <w:top w:w="120" w:type="dxa"/>
+              <w:bottom w:w="120" w:type="dxa"/>
+              <w:left w:w="160" w:type="dxa"/>
+              <w:right w:w="160" w:type="dxa"/>
+            </w:tcMar>
+            <w:vAlign w:val="center"/>
+          </w:tcPr>
+          <w:p>
+            <w:pPr>
+              <w:spacing w:before="20" w:after="20" w:line="276" w:lineRule="auto"/>
+            </w:pPr>
+            <w:r>
+              <w:rPr>
+                <w:rFonts w:ascii="Segoe UI" w:hAnsi="Segoe UI"/>
+                <w:sz w:val="19"/>
+              </w:rPr>
+              <w:t>Lập trình Backend Auth JWT HS256, BCrypt, RBAC; dựng khung Frontend React.</w:t>
+            </w:r>
+          </w:p>
+        </w:tc>
+        <w:tc>
+          <w:tcPr>
+            <w:tcW w:type="dxa" w:w="1872"/>
+            <w:shd w:fill="F8FAFC"/>
             <w:tcMar>
               <w:top w:w="120" w:type="dxa"/>
               <w:bottom w:w="120" w:type="dxa"/>
@@ -2340,8 +2905,8 @@
       <w:tr>
         <w:tc>
           <w:tcPr>
-            <w:tcW w:type="dxa" w:w="2340"/>
-            <w:shd w:fill="F8FAFC"/>
+            <w:tcW w:type="dxa" w:w="1872"/>
+            <w:shd w:fill="FFFFFF"/>
             <w:tcMar>
               <w:top w:w="120" w:type="dxa"/>
               <w:bottom w:w="120" w:type="dxa"/>
@@ -2364,8 +2929,8 @@
         </w:tc>
         <w:tc>
           <w:tcPr>
-            <w:tcW w:type="dxa" w:w="2340"/>
-            <w:shd w:fill="F8FAFC"/>
+            <w:tcW w:type="dxa" w:w="1872"/>
+            <w:shd w:fill="FFFFFF"/>
             <w:tcMar>
               <w:top w:w="120" w:type="dxa"/>
               <w:bottom w:w="120" w:type="dxa"/>
@@ -2389,8 +2954,8 @@
         </w:tc>
         <w:tc>
           <w:tcPr>
-            <w:tcW w:type="dxa" w:w="2340"/>
-            <w:shd w:fill="F8FAFC"/>
+            <w:tcW w:type="dxa" w:w="1872"/>
+            <w:shd w:fill="FFFFFF"/>
             <w:tcMar>
               <w:top w:w="120" w:type="dxa"/>
               <w:bottom w:w="120" w:type="dxa"/>
@@ -2408,14 +2973,14 @@
                 <w:rFonts w:ascii="Segoe UI" w:hAnsi="Segoe UI"/>
                 <w:sz w:val="19"/>
               </w:rPr>
-              <w:t>Lập trình CRUD tin việc làm, bộ lọc tìm kiếm, nộp hồ sơ ứng tuyển kèm CV.</w:t>
+              <w:t>06/11/2026</w:t>
             </w:r>
           </w:p>
         </w:tc>
         <w:tc>
           <w:tcPr>
-            <w:tcW w:type="dxa" w:w="2340"/>
-            <w:shd w:fill="F8FAFC"/>
+            <w:tcW w:type="dxa" w:w="1872"/>
+            <w:shd w:fill="FFFFFF"/>
             <w:tcMar>
               <w:top w:w="120" w:type="dxa"/>
               <w:bottom w:w="120" w:type="dxa"/>
@@ -2433,7 +2998,32 @@
                 <w:rFonts w:ascii="Segoe UI" w:hAnsi="Segoe UI"/>
                 <w:sz w:val="19"/>
               </w:rPr>
-              <w:t>Module Jobs + Applications hoạt động hoàn chỉnh.</w:t>
+              <w:t>CRUD tin việc làm, bộ lọc tìm kiếm, nộp hồ sơ ứng tuyển kèm CV.</w:t>
+            </w:r>
+          </w:p>
+        </w:tc>
+        <w:tc>
+          <w:tcPr>
+            <w:tcW w:type="dxa" w:w="1872"/>
+            <w:shd w:fill="FFFFFF"/>
+            <w:tcMar>
+              <w:top w:w="120" w:type="dxa"/>
+              <w:bottom w:w="120" w:type="dxa"/>
+              <w:left w:w="160" w:type="dxa"/>
+              <w:right w:w="160" w:type="dxa"/>
+            </w:tcMar>
+            <w:vAlign w:val="center"/>
+          </w:tcPr>
+          <w:p>
+            <w:pPr>
+              <w:spacing w:before="20" w:after="20" w:line="276" w:lineRule="auto"/>
+            </w:pPr>
+            <w:r>
+              <w:rPr>
+                <w:rFonts w:ascii="Segoe UI" w:hAnsi="Segoe UI"/>
+                <w:sz w:val="19"/>
+              </w:rPr>
+              <w:t>Module Jobs + Applications hoàn chỉnh.</w:t>
             </w:r>
           </w:p>
         </w:tc>
@@ -2441,8 +3031,8 @@
       <w:tr>
         <w:tc>
           <w:tcPr>
-            <w:tcW w:type="dxa" w:w="2340"/>
-            <w:shd w:fill="FFFFFF"/>
+            <w:tcW w:type="dxa" w:w="1872"/>
+            <w:shd w:fill="F8FAFC"/>
             <w:tcMar>
               <w:top w:w="120" w:type="dxa"/>
               <w:bottom w:w="120" w:type="dxa"/>
@@ -2465,8 +3055,8 @@
         </w:tc>
         <w:tc>
           <w:tcPr>
-            <w:tcW w:type="dxa" w:w="2340"/>
-            <w:shd w:fill="FFFFFF"/>
+            <w:tcW w:type="dxa" w:w="1872"/>
+            <w:shd w:fill="F8FAFC"/>
             <w:tcMar>
               <w:top w:w="120" w:type="dxa"/>
               <w:bottom w:w="120" w:type="dxa"/>
@@ -2490,8 +3080,8 @@
         </w:tc>
         <w:tc>
           <w:tcPr>
-            <w:tcW w:type="dxa" w:w="2340"/>
-            <w:shd w:fill="FFFFFF"/>
+            <w:tcW w:type="dxa" w:w="1872"/>
+            <w:shd w:fill="F8FAFC"/>
             <w:tcMar>
               <w:top w:w="120" w:type="dxa"/>
               <w:bottom w:w="120" w:type="dxa"/>
@@ -2509,14 +3099,39 @@
                 <w:rFonts w:ascii="Segoe UI" w:hAnsi="Segoe UI"/>
                 <w:sz w:val="19"/>
               </w:rPr>
-              <w:t>Lập trình Đánh giá 2 chiều, Thông báo, trang Admin; viết Unit Test JUnit 5 &amp; kịch bản Postman.</w:t>
+              <w:t>13/11/2026</w:t>
             </w:r>
           </w:p>
         </w:tc>
         <w:tc>
           <w:tcPr>
-            <w:tcW w:type="dxa" w:w="2340"/>
-            <w:shd w:fill="FFFFFF"/>
+            <w:tcW w:type="dxa" w:w="1872"/>
+            <w:shd w:fill="F8FAFC"/>
+            <w:tcMar>
+              <w:top w:w="120" w:type="dxa"/>
+              <w:bottom w:w="120" w:type="dxa"/>
+              <w:left w:w="160" w:type="dxa"/>
+              <w:right w:w="160" w:type="dxa"/>
+            </w:tcMar>
+            <w:vAlign w:val="center"/>
+          </w:tcPr>
+          <w:p>
+            <w:pPr>
+              <w:spacing w:before="20" w:after="20" w:line="276" w:lineRule="auto"/>
+            </w:pPr>
+            <w:r>
+              <w:rPr>
+                <w:rFonts w:ascii="Segoe UI" w:hAnsi="Segoe UI"/>
+                <w:sz w:val="19"/>
+              </w:rPr>
+              <w:t>Đánh giá 2 chiều, Thông báo, Admin Portal; 21 Test Cases + 30 Unit Tests.</w:t>
+            </w:r>
+          </w:p>
+        </w:tc>
+        <w:tc>
+          <w:tcPr>
+            <w:tcW w:type="dxa" w:w="1872"/>
+            <w:shd w:fill="F8FAFC"/>
             <w:tcMar>
               <w:top w:w="120" w:type="dxa"/>
               <w:bottom w:w="120" w:type="dxa"/>
@@ -2542,7 +3157,133 @@
       <w:tr>
         <w:tc>
           <w:tcPr>
-            <w:tcW w:type="dxa" w:w="2340"/>
+            <w:tcW w:type="dxa" w:w="1872"/>
+            <w:shd w:fill="FFFFFF"/>
+            <w:tcMar>
+              <w:top w:w="120" w:type="dxa"/>
+              <w:bottom w:w="120" w:type="dxa"/>
+              <w:left w:w="160" w:type="dxa"/>
+              <w:right w:w="160" w:type="dxa"/>
+            </w:tcMar>
+            <w:vAlign w:val="center"/>
+          </w:tcPr>
+          <w:p>
+            <w:pPr>
+              <w:spacing w:before="20" w:after="20" w:line="276" w:lineRule="auto"/>
+            </w:pPr>
+            <w:r>
+              <w:rPr>
+                <w:b/>
+              </w:rPr>
+              <w:t>Sprint 5</w:t>
+            </w:r>
+          </w:p>
+        </w:tc>
+        <w:tc>
+          <w:tcPr>
+            <w:tcW w:type="dxa" w:w="1872"/>
+            <w:shd w:fill="FFFFFF"/>
+            <w:tcMar>
+              <w:top w:w="120" w:type="dxa"/>
+              <w:bottom w:w="120" w:type="dxa"/>
+              <w:left w:w="160" w:type="dxa"/>
+              <w:right w:w="160" w:type="dxa"/>
+            </w:tcMar>
+            <w:vAlign w:val="center"/>
+          </w:tcPr>
+          <w:p>
+            <w:pPr>
+              <w:spacing w:before="20" w:after="20" w:line="276" w:lineRule="auto"/>
+            </w:pPr>
+            <w:r>
+              <w:rPr>
+                <w:rFonts w:ascii="Segoe UI" w:hAnsi="Segoe UI"/>
+                <w:sz w:val="19"/>
+              </w:rPr>
+              <w:t>Buổi 9</w:t>
+            </w:r>
+          </w:p>
+        </w:tc>
+        <w:tc>
+          <w:tcPr>
+            <w:tcW w:type="dxa" w:w="1872"/>
+            <w:shd w:fill="FFFFFF"/>
+            <w:tcMar>
+              <w:top w:w="120" w:type="dxa"/>
+              <w:bottom w:w="120" w:type="dxa"/>
+              <w:left w:w="160" w:type="dxa"/>
+              <w:right w:w="160" w:type="dxa"/>
+            </w:tcMar>
+            <w:vAlign w:val="center"/>
+          </w:tcPr>
+          <w:p>
+            <w:pPr>
+              <w:spacing w:before="20" w:after="20" w:line="276" w:lineRule="auto"/>
+            </w:pPr>
+            <w:r>
+              <w:rPr>
+                <w:rFonts w:ascii="Segoe UI" w:hAnsi="Segoe UI"/>
+                <w:sz w:val="19"/>
+              </w:rPr>
+              <w:t>20/11/2026</w:t>
+            </w:r>
+          </w:p>
+        </w:tc>
+        <w:tc>
+          <w:tcPr>
+            <w:tcW w:type="dxa" w:w="1872"/>
+            <w:shd w:fill="FFFFFF"/>
+            <w:tcMar>
+              <w:top w:w="120" w:type="dxa"/>
+              <w:bottom w:w="120" w:type="dxa"/>
+              <w:left w:w="160" w:type="dxa"/>
+              <w:right w:w="160" w:type="dxa"/>
+            </w:tcMar>
+            <w:vAlign w:val="center"/>
+          </w:tcPr>
+          <w:p>
+            <w:pPr>
+              <w:spacing w:before="20" w:after="20" w:line="276" w:lineRule="auto"/>
+            </w:pPr>
+            <w:r>
+              <w:rPr>
+                <w:rFonts w:ascii="Segoe UI" w:hAnsi="Segoe UI"/>
+                <w:sz w:val="19"/>
+              </w:rPr>
+              <w:t>Docker Compose 3 dịch vụ, 1-Click Launcher, video demo.</w:t>
+            </w:r>
+          </w:p>
+        </w:tc>
+        <w:tc>
+          <w:tcPr>
+            <w:tcW w:type="dxa" w:w="1872"/>
+            <w:shd w:fill="FFFFFF"/>
+            <w:tcMar>
+              <w:top w:w="120" w:type="dxa"/>
+              <w:bottom w:w="120" w:type="dxa"/>
+              <w:left w:w="160" w:type="dxa"/>
+              <w:right w:w="160" w:type="dxa"/>
+            </w:tcMar>
+            <w:vAlign w:val="center"/>
+          </w:tcPr>
+          <w:p>
+            <w:pPr>
+              <w:spacing w:before="20" w:after="20" w:line="276" w:lineRule="auto"/>
+            </w:pPr>
+            <w:r>
+              <w:rPr>
+                <w:rFonts w:ascii="Segoe UI" w:hAnsi="Segoe UI"/>
+                <w:sz w:val="19"/>
+              </w:rPr>
+              <w:t>Docker hoàn chỉnh, run.bat chạy được.</w:t>
+            </w:r>
+          </w:p>
+        </w:tc>
+      </w:tr>
+      <w:tr>
+        <w:tc>
+          <w:tcPr>
+            <w:tcW w:type="dxa" w:w="1872"/>
             <w:shd w:fill="F8FAFC"/>
             <w:tcMar>
               <w:top w:w="120" w:type="dxa"/>
@@ -2566,7 +3307,55 @@
         </w:tc>
         <w:tc>
           <w:tcPr>
-            <w:tcW w:type="dxa" w:w="2340"/>
+            <w:tcW w:type="dxa" w:w="1872"/>
+            <w:shd w:fill="F8FAFC"/>
+            <w:tcMar>
+              <w:top w:w="120" w:type="dxa"/>
+              <w:bottom w:w="120" w:type="dxa"/>
+              <w:left w:w="160" w:type="dxa"/>
+              <w:right w:w="160" w:type="dxa"/>
+            </w:tcMar>
+            <w:vAlign w:val="center"/>
+          </w:tcPr>
+          <w:p>
+            <w:pPr>
+              <w:spacing w:before="20" w:after="20" w:line="276" w:lineRule="auto"/>
+            </w:pPr>
+            <w:r>
+              <w:rPr>
+                <w:b/>
+              </w:rPr>
+              <w:t>Buổi 10</w:t>
+            </w:r>
+          </w:p>
+        </w:tc>
+        <w:tc>
+          <w:tcPr>
+            <w:tcW w:type="dxa" w:w="1872"/>
+            <w:shd w:fill="F8FAFC"/>
+            <w:tcMar>
+              <w:top w:w="120" w:type="dxa"/>
+              <w:bottom w:w="120" w:type="dxa"/>
+              <w:left w:w="160" w:type="dxa"/>
+              <w:right w:w="160" w:type="dxa"/>
+            </w:tcMar>
+            <w:vAlign w:val="center"/>
+          </w:tcPr>
+          <w:p>
+            <w:pPr>
+              <w:spacing w:before="20" w:after="20" w:line="276" w:lineRule="auto"/>
+            </w:pPr>
+            <w:r>
+              <w:rPr>
+                <w:b/>
+              </w:rPr>
+              <w:t>27/11/2026 🎯 Cuối kỳ</w:t>
+            </w:r>
+          </w:p>
+        </w:tc>
+        <w:tc>
+          <w:tcPr>
+            <w:tcW w:type="dxa" w:w="1872"/>
             <w:shd w:fill="F8FAFC"/>
             <w:tcMar>
               <w:top w:w="120" w:type="dxa"/>
@@ -2585,13 +3374,13 @@
                 <w:rFonts w:ascii="Segoe UI" w:hAnsi="Segoe UI"/>
                 <w:sz w:val="19"/>
               </w:rPr>
-              <w:t>Buổi 9–10</w:t>
+              <w:t>Hoàn thiện báo cáo tổng kết, Slide bảo vệ, Demo Live trước Hội đồng.</w:t>
             </w:r>
           </w:p>
         </w:tc>
         <w:tc>
           <w:tcPr>
-            <w:tcW w:type="dxa" w:w="2340"/>
+            <w:tcW w:type="dxa" w:w="1872"/>
             <w:shd w:fill="F8FAFC"/>
             <w:tcMar>
               <w:top w:w="120" w:type="dxa"/>
@@ -2610,32 +3399,7 @@
                 <w:rFonts w:ascii="Segoe UI" w:hAnsi="Segoe UI"/>
                 <w:sz w:val="19"/>
               </w:rPr>
-              <w:t>Đóng gói Docker Compose, cấu hình One-Click Runner, hoàn thiện báo cáo và bảo vệ đồ án.</w:t>
-            </w:r>
-          </w:p>
-        </w:tc>
-        <w:tc>
-          <w:tcPr>
-            <w:tcW w:type="dxa" w:w="2340"/>
-            <w:shd w:fill="F8FAFC"/>
-            <w:tcMar>
-              <w:top w:w="120" w:type="dxa"/>
-              <w:bottom w:w="120" w:type="dxa"/>
-              <w:left w:w="160" w:type="dxa"/>
-              <w:right w:w="160" w:type="dxa"/>
-            </w:tcMar>
-            <w:vAlign w:val="center"/>
-          </w:tcPr>
-          <w:p>
-            <w:pPr>
-              <w:spacing w:before="20" w:after="20" w:line="276" w:lineRule="auto"/>
-            </w:pPr>
-            <w:r>
-              <w:rPr>
-                <w:rFonts w:ascii="Segoe UI" w:hAnsi="Segoe UI"/>
-                <w:sz w:val="19"/>
-              </w:rPr>
-              <w:t>Bộ mã nguồn hoàn chỉnh, Docker chạy 1 lệnh, Slide &amp; Báo cáo nghiệm thu.</w:t>
+              <w:t>Bộ mã nguồn hoàn chỉnh, Báo cáo nghiệm thu Rubric 3.</w:t>
             </w:r>
           </w:p>
         </w:tc>

</xml_diff>